<commit_message>
v0.78: root intent field end-to-end (engine todo 2) - empirical negative result
- offline evidence: C-A1 FAIL (segment-start single-token injection no trajectory-direction conduction) / C-A3 PASS (human core-cling 0.975 vs AI 0.948, d=+1.61)
- 24 online runs (vt_field/vt_field_persist/vt_field_frozen/vt_field_full): C-B1 conduction FAIL (delta_R_T=-0.019, p=0.345) - R follows actual surface F, not injected target T
- mechanism: root intent = faithful online estimator, not controller; injection-generation gap; measurement ceiling (R0-T cos 0.90-0.98); alpha-insensitive
- surface layer plastic: frozen/full Hurst 0.63-0.65 hits human band - boundary correction: training-time regularization is the path (engine todo 4)
- scripts: engine_field_evidence/calib/metrics.py + gen_theme_guidance field conditions (3-cond regression hash PASS)
- papers ZH/EN 6.4 updated + docx regenerated

Co-Authored-By: Claude <noreply@anthropic.com>
</commit_message>
<xml_diff>
--- a/论文/Intent-Dynamics-EN.docx
+++ b/论文/Intent-Dynamics-EN.docx
@@ -6950,7 +6950,171 @@
           <w:i w:val="0"/>
           <w:sz w:val="20"/>
         </w:rPr>
-        <w:t>: root intent (document/external core) → deviation detection (trajectory–field distance, clause-level) → above-threshold triggers vt-channel pull-back — "free fluctuation + field pull-back" generation loop</w:t>
+        <w:t xml:space="preserve"> (— ✅ IMPLEMENTED v0.78 — </w:t>
+      </w:r>
+      <w:r>
+        <w:rPr>
+          <w:rFonts w:ascii="Times New Roman" w:hAnsi="Times New Roman" w:eastAsia="宋体"/>
+          <w:b/>
+          <w:i w:val="0"/>
+          <w:sz w:val="20"/>
+        </w:rPr>
+        <w:t>result: inference-time injection cannot reshape root intent — surface layer is plastic — empirical boundary correction</w:t>
+      </w:r>
+      <w:r>
+        <w:rPr>
+          <w:rFonts w:ascii="Times New Roman" w:hAnsi="Times New Roman" w:eastAsia="宋体"/>
+          <w:b w:val="0"/>
+          <w:i w:val="0"/>
+          <w:sz w:val="20"/>
+        </w:rPr>
+        <w:t xml:space="preserve">): root intent R (constructive anchor — prompt-core start) → clause-level deviation detection (projection e=0.90−F·R — gated at 0.05/0.02, reusing existing thresholds) → above-threshold vt-channel pull-back (dimension-weighted steering v_pull=norm(W⊙R) — only weights dimensions contributing most to deviation) → </w:t>
+      </w:r>
+      <w:r>
+        <w:rPr>
+          <w:rFonts w:ascii="Times New Roman" w:hAnsi="Times New Roman" w:eastAsia="宋体"/>
+          <w:b/>
+          <w:i w:val="0"/>
+          <w:sz w:val="20"/>
+        </w:rPr>
+        <w:t>surface→root update</w:t>
+      </w:r>
+      <w:r>
+        <w:rPr>
+          <w:rFonts w:ascii="Times New Roman" w:hAnsi="Times New Roman" w:eastAsia="宋体"/>
+          <w:b w:val="0"/>
+          <w:i w:val="0"/>
+          <w:sz w:val="20"/>
+        </w:rPr>
+        <w:t xml:space="preserve"> (slow EWMA R←norm((1−α)R+αF̄) — 3-clause sliding window for denoising — the bidirectional root×surface interaction) — 24 runs (vt_field autonomous loop / vt_field_persist internalization test / vt_field_frozen frozen control / vt_field_full sustained injection):</w:t>
+      </w:r>
+    </w:p>
+    <w:p>
+      <w:pPr>
+        <w:spacing w:after="60" w:line="300" w:lineRule="auto"/>
+      </w:pPr>
+      <w:r>
+        <w:rPr>
+          <w:rFonts w:ascii="Times New Roman" w:hAnsi="Times New Roman" w:eastAsia="宋体"/>
+          <w:b/>
+          <w:i w:val="0"/>
+          <w:sz w:val="20"/>
+        </w:rPr>
+        <w:t>C-B1 conduction FAIL</w:t>
+      </w:r>
+      <w:r>
+        <w:rPr>
+          <w:rFonts w:ascii="Times New Roman" w:hAnsi="Times New Roman" w:eastAsia="宋体"/>
+          <w:b w:val="0"/>
+          <w:i w:val="0"/>
+          <w:sz w:val="20"/>
+        </w:rPr>
+        <w:t xml:space="preserve"> (ΔR_T=−0.019, p=0.345 — R not pulled toward T=human core) — α calibration 0.02/0.05/0.1 identical (α-insensitive)</w:t>
+      </w:r>
+    </w:p>
+    <w:p>
+      <w:pPr>
+        <w:spacing w:after="60" w:line="300" w:lineRule="auto"/>
+      </w:pPr>
+      <w:r>
+        <w:rPr>
+          <w:rFonts w:ascii="Times New Roman" w:hAnsi="Times New Roman" w:eastAsia="宋体"/>
+          <w:b/>
+          <w:i w:val="0"/>
+          <w:sz w:val="20"/>
+        </w:rPr>
+        <w:t>Mechanism diagnosis</w:t>
+      </w:r>
+      <w:r>
+        <w:rPr>
+          <w:rFonts w:ascii="Times New Roman" w:hAnsi="Times New Roman" w:eastAsia="宋体"/>
+          <w:b w:val="0"/>
+          <w:i w:val="0"/>
+          <w:sz w:val="20"/>
+        </w:rPr>
+        <w:t xml:space="preserve">: root intent R is a </w:t>
+      </w:r>
+      <w:r>
+        <w:rPr>
+          <w:rFonts w:ascii="Times New Roman" w:hAnsi="Times New Roman" w:eastAsia="宋体"/>
+          <w:b/>
+          <w:i w:val="0"/>
+          <w:sz w:val="20"/>
+        </w:rPr>
+        <w:t>faithful online estimator of the trajectory, not a controller</w:t>
+      </w:r>
+      <w:r>
+        <w:rPr>
+          <w:rFonts w:ascii="Times New Roman" w:hAnsi="Times New Roman" w:eastAsia="宋体"/>
+          <w:b w:val="0"/>
+          <w:i w:val="0"/>
+          <w:sz w:val="20"/>
+        </w:rPr>
+        <w:t xml:space="preserve"> — R follows the actual surface F, not the injected instruction T (F only aligns with T at 0.37–0.98, prompt-dependent) — an injection-target vs generation-realization gap (single-token injection pressure &lt; 0.5B model prior) — measurement ceiling (R0–T cosine 0.90–0.98)</w:t>
+      </w:r>
+    </w:p>
+    <w:p>
+      <w:pPr>
+        <w:spacing w:after="60" w:line="300" w:lineRule="auto"/>
+      </w:pPr>
+      <w:r>
+        <w:rPr>
+          <w:rFonts w:ascii="Times New Roman" w:hAnsi="Times New Roman" w:eastAsia="宋体"/>
+          <w:b/>
+          <w:i w:val="0"/>
+          <w:sz w:val="20"/>
+        </w:rPr>
+        <w:t>Surface-layer genuine effect</w:t>
+      </w:r>
+      <w:r>
+        <w:rPr>
+          <w:rFonts w:ascii="Times New Roman" w:hAnsi="Times New Roman" w:eastAsia="宋体"/>
+          <w:b w:val="0"/>
+          <w:i w:val="0"/>
+          <w:sz w:val="20"/>
+        </w:rPr>
+        <w:t xml:space="preserve">: vt_field_frozen/full dim10_hurst 0.63–0.65 </w:t>
+      </w:r>
+      <w:r>
+        <w:rPr>
+          <w:rFonts w:ascii="Times New Roman" w:hAnsi="Times New Roman" w:eastAsia="宋体"/>
+          <w:b/>
+          <w:i w:val="0"/>
+          <w:sz w:val="20"/>
+        </w:rPr>
+        <w:t>hits the human band</w:t>
+      </w:r>
+      <w:r>
+        <w:rPr>
+          <w:rFonts w:ascii="Times New Roman" w:hAnsi="Times New Roman" w:eastAsia="宋体"/>
+          <w:b w:val="0"/>
+          <w:i w:val="0"/>
+          <w:sz w:val="20"/>
+        </w:rPr>
+        <w:t xml:space="preserve"> (0.60–0.70) — human-core injection improves surface long-range memory — surface is plastic</w:t>
+      </w:r>
+    </w:p>
+    <w:p>
+      <w:pPr>
+        <w:spacing w:after="60" w:line="300" w:lineRule="auto"/>
+      </w:pPr>
+      <w:r>
+        <w:rPr>
+          <w:rFonts w:ascii="Times New Roman" w:hAnsi="Times New Roman" w:eastAsia="宋体"/>
+          <w:b/>
+          <w:i w:val="0"/>
+          <w:sz w:val="20"/>
+        </w:rPr>
+        <w:t>Empirical correction</w:t>
+      </w:r>
+      <w:r>
+        <w:rPr>
+          <w:rFonts w:ascii="Times New Roman" w:hAnsi="Times New Roman" w:eastAsia="宋体"/>
+          <w:b w:val="0"/>
+          <w:i w:val="0"/>
+          <w:sz w:val="20"/>
+        </w:rPr>
+        <w:t>: the boundary between surface-layer intervention (plastic — 201-run spectrum + Hurst hit) and root-intent-layer intervention (unreachable at inference — needs training-time) — offline evidence likewise FAIL (segment-start single-token injection shows no trajectory-direction conduction — sent_proj gain ≠ trajectory-direction conduction)</w:t>
       </w:r>
     </w:p>
     <w:p>
@@ -6996,7 +7160,7 @@
           <w:i w:val="0"/>
           <w:sz w:val="20"/>
         </w:rPr>
-        <w:t>: dim48/dim10 as loss terms (φ jointly optimized with LM — eliminating OOD injection)</w:t>
+        <w:t xml:space="preserve"> (— the right path after the v0.78 negative result): dim48/dim10 as loss terms (φ jointly optimized with LM — eliminating OOD injection) — inference-time injection cannot change the generated trajectory itself; training-time regularization shapes the trajectory directly — grounded in R's faithful following of F (the surface trajectory is the observation of root intent — changing the trajectory = changing root intent)</w:t>
       </w:r>
     </w:p>
     <w:p>

</xml_diff>

<commit_message>
v0.79: intent-axis hypothesis test (offline) - binary negation + continuum correction
- hypothesis: human jump d=+2.16 = directed propulsion along an intent axis D; AI = isotropic drift
- verdict NEGATED (preregistered C1-C8): BOTH groups have strong axes (PC1 EVR 0.663/0.596 vs isotropic baseline 0.018 - 36x) with aligned group axes (cos 0.985) - the axis is discriminator-space structure, not human-specific
- continuum correction: humans advance flatter along the axis (ratio_unit 0.086 vs 0.105, d=-3.18 - NEW discriminator stronger than jump d=+2.16); memory not on difference axis (H(alpha)<H(eps)); inter-group drift directions opposite (cos=-0.29)
- exploratory hit: within-human Spearman(align_cos, j_par)=+0.745 (p=0.013)
- method: centered per-group/merged PCA, strict time split (60% fit/40% evaluate), sign-fixed D, size-matched isotropic surrogates, P0 prerun calibration
- papers ZH/EN 6.5 added + docx regenerated

Co-Authored-By: Claude <noreply@anthropic.com>
</commit_message>
<xml_diff>
--- a/论文/Intent-Dynamics-EN.docx
+++ b/论文/Intent-Dynamics-EN.docx
@@ -7184,6 +7184,271 @@
           <w:sz w:val="20"/>
         </w:rPr>
         <w:t>: end-to-end generation → five flow metrics (jump/turn/Hurst/TE/coupling) should approach the human portrait — the engine's acceptance criterion</w:t>
+      </w:r>
+    </w:p>
+    <w:p>
+      <w:pPr>
+        <w:keepNext/>
+        <w:spacing w:before="160" w:after="100"/>
+      </w:pPr>
+      <w:r>
+        <w:rPr>
+          <w:rFonts w:ascii="Times New Roman" w:hAnsi="Times New Roman" w:eastAsia="黑体"/>
+          <w:b/>
+          <w:i w:val="0"/>
+          <w:sz w:val="25"/>
+        </w:rPr>
+        <w:t>6.5 Intent-Axis Hypothesis Test (v0.79 — binary negation — continuum correction — offline)</w:t>
+      </w:r>
+    </w:p>
+    <w:p>
+      <w:pPr>
+        <w:spacing w:after="120" w:line="300" w:lineRule="auto"/>
+        <w:ind w:firstLine="420"/>
+      </w:pPr>
+      <w:r>
+        <w:rPr>
+          <w:rFonts w:ascii="Times New Roman" w:hAnsi="Times New Roman" w:eastAsia="宋体"/>
+          <w:b/>
+          <w:i w:val="0"/>
+          <w:sz w:val="21"/>
+        </w:rPr>
+        <w:t>Hypothesis</w:t>
+      </w:r>
+      <w:r>
+        <w:rPr>
+          <w:rFonts w:ascii="Times New Roman" w:hAnsi="Times New Roman" w:eastAsia="宋体"/>
+          <w:b w:val="0"/>
+          <w:i w:val="0"/>
+          <w:sz w:val="21"/>
+        </w:rPr>
+        <w:t>: human jump d=+2.16 may not be random jumps — a "root-intent axis" D exists in the high-dim space — humans advance along the axis (directed change) — AI drifts isotropically without direction ("directed propulsion vs directionless diffusion").</w:t>
+      </w:r>
+    </w:p>
+    <w:p>
+      <w:pPr>
+        <w:spacing w:after="120" w:line="300" w:lineRule="auto"/>
+        <w:ind w:firstLine="420"/>
+      </w:pPr>
+      <w:r>
+        <w:rPr>
+          <w:rFonts w:ascii="Times New Roman" w:hAnsi="Times New Roman" w:eastAsia="宋体"/>
+          <w:b/>
+          <w:i w:val="0"/>
+          <w:sz w:val="21"/>
+        </w:rPr>
+        <w:t>Verdict (criteria C1–C8 preregistered — overall: NEGATED)</w:t>
+      </w:r>
+      <w:r>
+        <w:rPr>
+          <w:rFonts w:ascii="Times New Roman" w:hAnsi="Times New Roman" w:eastAsia="宋体"/>
+          <w:b w:val="0"/>
+          <w:i w:val="0"/>
+          <w:sz w:val="21"/>
+        </w:rPr>
+        <w:t>:</w:t>
+      </w:r>
+    </w:p>
+    <w:p>
+      <w:pPr>
+        <w:spacing w:after="60" w:line="300" w:lineRule="auto"/>
+      </w:pPr>
+      <w:r>
+        <w:rPr>
+          <w:rFonts w:ascii="Times New Roman" w:hAnsi="Times New Roman" w:eastAsia="宋体"/>
+          <w:b/>
+          <w:i w:val="0"/>
+          <w:sz w:val="20"/>
+        </w:rPr>
+        <w:t>Both groups have a strong axis</w:t>
+      </w:r>
+      <w:r>
+        <w:rPr>
+          <w:rFonts w:ascii="Times New Roman" w:hAnsi="Times New Roman" w:eastAsia="宋体"/>
+          <w:b w:val="0"/>
+          <w:i w:val="0"/>
+          <w:sz w:val="20"/>
+        </w:rPr>
+        <w:t xml:space="preserve">: difference-pool PC1 explained variance human 0.663 / AI 0.596 (isotropic surrogate baseline 0.018 — 36× above) — group axes nearly aligned </w:t>
+      </w:r>
+      <w:r>
+        <w:rPr>
+          <w:rFonts w:ascii="Times New Roman" w:hAnsi="Times New Roman" w:eastAsia="宋体"/>
+          <w:b/>
+          <w:i w:val="0"/>
+          <w:sz w:val="20"/>
+        </w:rPr>
+        <w:t>cos(D_h, D_a)=0.985</w:t>
+      </w:r>
+      <w:r>
+        <w:rPr>
+          <w:rFonts w:ascii="Times New Roman" w:hAnsi="Times New Roman" w:eastAsia="宋体"/>
+          <w:b w:val="0"/>
+          <w:i w:val="0"/>
+          <w:sz w:val="20"/>
+        </w:rPr>
+        <w:t xml:space="preserve"> — the axis is an inherent structure of the discriminator space (dominant direction of fp space) — the "humans have an axis, AI does not" dichotomy fails</w:t>
+      </w:r>
+    </w:p>
+    <w:p>
+      <w:pPr>
+        <w:spacing w:after="60" w:line="300" w:lineRule="auto"/>
+      </w:pPr>
+      <w:r>
+        <w:rPr>
+          <w:rFonts w:ascii="Times New Roman" w:hAnsi="Times New Roman" w:eastAsia="宋体"/>
+          <w:b/>
+          <w:i w:val="0"/>
+          <w:sz w:val="20"/>
+        </w:rPr>
+        <w:t>The real difference is a continuum</w:t>
+      </w:r>
+      <w:r>
+        <w:rPr>
+          <w:rFonts w:ascii="Times New Roman" w:hAnsi="Times New Roman" w:eastAsia="宋体"/>
+          <w:b w:val="0"/>
+          <w:i w:val="0"/>
+          <w:sz w:val="20"/>
+        </w:rPr>
+        <w:t xml:space="preserve">: direction consistency align_cos (amplitude-free — mean|û·D|) human 0.632 vs AI 0.581 (d=+2.56); </w:t>
+      </w:r>
+      <w:r>
+        <w:rPr>
+          <w:rFonts w:ascii="Times New Roman" w:hAnsi="Times New Roman" w:eastAsia="宋体"/>
+          <w:b/>
+          <w:i w:val="0"/>
+          <w:sz w:val="20"/>
+        </w:rPr>
+        <w:t>propulsion concentration ratio_unit=j_perp/j_par human 0.086 vs AI 0.105 (d=−3.18 — a stronger discriminator than jump d=+2.16)</w:t>
+      </w:r>
+      <w:r>
+        <w:rPr>
+          <w:rFonts w:ascii="Times New Roman" w:hAnsi="Times New Roman" w:eastAsia="宋体"/>
+          <w:b w:val="0"/>
+          <w:i w:val="0"/>
+          <w:sz w:val="20"/>
+        </w:rPr>
+        <w:t xml:space="preserve"> — "</w:t>
+      </w:r>
+      <w:r>
+        <w:rPr>
+          <w:rFonts w:ascii="Times New Roman" w:hAnsi="Times New Roman" w:eastAsia="宋体"/>
+          <w:b/>
+          <w:i w:val="0"/>
+          <w:sz w:val="20"/>
+        </w:rPr>
+        <w:t>humans advance flatter along the axis; AI spreads rounder</w:t>
+      </w:r>
+      <w:r>
+        <w:rPr>
+          <w:rFonts w:ascii="Times New Roman" w:hAnsi="Times New Roman" w:eastAsia="宋体"/>
+          <w:b w:val="0"/>
+          <w:i w:val="0"/>
+          <w:sz w:val="20"/>
+        </w:rPr>
+        <w:t>"</w:t>
+      </w:r>
+    </w:p>
+    <w:p>
+      <w:pPr>
+        <w:spacing w:after="60" w:line="300" w:lineRule="auto"/>
+      </w:pPr>
+      <w:r>
+        <w:rPr>
+          <w:rFonts w:ascii="Times New Roman" w:hAnsi="Times New Roman" w:eastAsia="宋体"/>
+          <w:b/>
+          <w:i w:val="0"/>
+          <w:sz w:val="20"/>
+        </w:rPr>
+        <w:t>Memory is not on the difference axis</w:t>
+      </w:r>
+      <w:r>
+        <w:rPr>
+          <w:rFonts w:ascii="Times New Roman" w:hAnsi="Times New Roman" w:eastAsia="宋体"/>
+          <w:b w:val="0"/>
+          <w:i w:val="0"/>
+          <w:sz w:val="20"/>
+        </w:rPr>
+        <w:t>: H(α)human−H(ε)human=−0.04 (α Hurst 0.13–0.17 — RS downward bias) — long-range memory (Hurst 0.62) is a state-level structure of activations, not a difference-direction structure</w:t>
+      </w:r>
+    </w:p>
+    <w:p>
+      <w:pPr>
+        <w:spacing w:after="60" w:line="300" w:lineRule="auto"/>
+      </w:pPr>
+      <w:r>
+        <w:rPr>
+          <w:rFonts w:ascii="Times New Roman" w:hAnsi="Times New Roman" w:eastAsia="宋体"/>
+          <w:b/>
+          <w:i w:val="0"/>
+          <w:sz w:val="20"/>
+        </w:rPr>
+        <w:t>New discriminative signal</w:t>
+      </w:r>
+      <w:r>
+        <w:rPr>
+          <w:rFonts w:ascii="Times New Roman" w:hAnsi="Times New Roman" w:eastAsia="宋体"/>
+          <w:b w:val="0"/>
+          <w:i w:val="0"/>
+          <w:sz w:val="20"/>
+        </w:rPr>
+        <w:t>: inter-group mean-drift directions opposite (cos(μ_h,μ_a)=−0.29)</w:t>
+      </w:r>
+    </w:p>
+    <w:p>
+      <w:pPr>
+        <w:spacing w:after="60" w:line="300" w:lineRule="auto"/>
+      </w:pPr>
+      <w:r>
+        <w:rPr>
+          <w:rFonts w:ascii="Times New Roman" w:hAnsi="Times New Roman" w:eastAsia="宋体"/>
+          <w:b w:val="0"/>
+          <w:i w:val="0"/>
+          <w:sz w:val="20"/>
+        </w:rPr>
+        <w:t>Exploratory consistency hit: within-human Spearman(align_cos, j_par)=+0.745 (p=0.013 — old "jump" = axis propulsion, within-group evidence)</w:t>
+      </w:r>
+    </w:p>
+    <w:p>
+      <w:pPr>
+        <w:spacing w:after="120" w:line="300" w:lineRule="auto"/>
+        <w:ind w:firstLine="420"/>
+      </w:pPr>
+      <w:r>
+        <w:rPr>
+          <w:rFonts w:ascii="Times New Roman" w:hAnsi="Times New Roman" w:eastAsia="宋体"/>
+          <w:b/>
+          <w:i w:val="0"/>
+          <w:sz w:val="21"/>
+        </w:rPr>
+        <w:t>Implication for the engine</w:t>
+      </w:r>
+      <w:r>
+        <w:rPr>
+          <w:rFonts w:ascii="Times New Roman" w:hAnsi="Times New Roman" w:eastAsia="宋体"/>
+          <w:b w:val="0"/>
+          <w:i w:val="0"/>
+          <w:sz w:val="21"/>
+        </w:rPr>
+        <w:t xml:space="preserve">: axis D is a shared structure — planner axis-coordinate targets (align_cos/ratio_unit human bands) should target the </w:t>
+      </w:r>
+      <w:r>
+        <w:rPr>
+          <w:rFonts w:ascii="Times New Roman" w:hAnsi="Times New Roman" w:eastAsia="宋体"/>
+          <w:b/>
+          <w:i w:val="0"/>
+          <w:sz w:val="21"/>
+        </w:rPr>
+        <w:t>organization of propulsion</w:t>
+      </w:r>
+      <w:r>
+        <w:rPr>
+          <w:rFonts w:ascii="Times New Roman" w:hAnsi="Times New Roman" w:eastAsia="宋体"/>
+          <w:b w:val="0"/>
+          <w:i w:val="0"/>
+          <w:sz w:val="21"/>
+        </w:rPr>
+        <w:t xml:space="preserve"> (concentration/drift direction), not axis existence — "propulsion concentration" is a candidate new discriminative feature (d=−3.18 &gt; jump d=+2.16) — formal inclusion requires independent test-set validation.</w:t>
       </w:r>
     </w:p>
     <w:p>

</xml_diff>

<commit_message>
v0.80: ratio_unit cross-corpus robustness validation - NEGATED (directional evidence retained)
- V-R1 FAIL: independent test set effect shrinks to d=-0.49 (1/6.5 of bilingual -3.18; paired Wilcoxon p=0.073 marginal) - not admitted as formal discriminator (user criterion d>1.5 unmet)
- baihua d=-1.07 (direction consistent, insufficient strength) / shiping d=+0.07 (officialese convergence - shiping seven-dim failure precedent)
- V-R2 PASS: low redundancy with sent_proj (pooled 0.049/within-human 0.595) - incremental value
- V-R4 PASS: intervention-space independence (delta-corr +0.021 - injection moves ratio_unit independently)
- axis stable across corpora (cos|0.99| - discriminator-space structure confirmed)
- shrinkage mechanism: short-text noise (5-19 diffs) toward isotropic anchor + shiping convergence
- scripts: engine_ratio_validate.py + axis_test D_shared persistence patch
- papers ZH/EN 6.5 negative-result note + docx regenerated

Co-Authored-By: Claude <noreply@anthropic.com>
</commit_message>
<xml_diff>
--- a/论文/Intent-Dynamics-EN.docx
+++ b/论文/Intent-Dynamics-EN.docx
@@ -7449,6 +7449,102 @@
           <w:sz w:val="21"/>
         </w:rPr>
         <w:t xml:space="preserve"> (concentration/drift direction), not axis existence — "propulsion concentration" is a candidate new discriminative feature (d=−3.18 &gt; jump d=+2.16) — formal inclusion requires independent test-set validation.</w:t>
+      </w:r>
+    </w:p>
+    <w:p>
+      <w:pPr>
+        <w:spacing w:after="120" w:line="300" w:lineRule="auto"/>
+        <w:ind w:firstLine="420"/>
+      </w:pPr>
+      <w:r>
+        <w:rPr>
+          <w:rFonts w:ascii="Times New Roman" w:hAnsi="Times New Roman" w:eastAsia="宋体"/>
+          <w:b/>
+          <w:i w:val="0"/>
+          <w:sz w:val="21"/>
+        </w:rPr>
+        <w:t>Independent test-set validation (v0.80 — NEGATED — directional evidence retained)</w:t>
+      </w:r>
+      <w:r>
+        <w:rPr>
+          <w:rFonts w:ascii="Times New Roman" w:hAnsi="Times New Roman" w:eastAsia="宋体"/>
+          <w:b w:val="0"/>
+          <w:i w:val="0"/>
+          <w:sz w:val="21"/>
+        </w:rPr>
+        <w:t xml:space="preserve">: on the independent test set (32 pairs baihua/shiping × human/ai/qwen three sides — frozen D, no fitting leakage) the ratio_unit effect shrinks to </w:t>
+      </w:r>
+      <w:r>
+        <w:rPr>
+          <w:rFonts w:ascii="Times New Roman" w:hAnsi="Times New Roman" w:eastAsia="宋体"/>
+          <w:b/>
+          <w:i w:val="0"/>
+          <w:sz w:val="21"/>
+        </w:rPr>
+        <w:t>d=−0.49</w:t>
+      </w:r>
+      <w:r>
+        <w:rPr>
+          <w:rFonts w:ascii="Times New Roman" w:hAnsi="Times New Roman" w:eastAsia="宋体"/>
+          <w:b w:val="0"/>
+          <w:i w:val="0"/>
+          <w:sz w:val="21"/>
+        </w:rPr>
+        <w:t xml:space="preserve"> (1/6.5 of bilingual −3.18 — paired Wilcoxon p=0.073 marginal) — </w:t>
+      </w:r>
+      <w:r>
+        <w:rPr>
+          <w:rFonts w:ascii="Times New Roman" w:hAnsi="Times New Roman" w:eastAsia="宋体"/>
+          <w:b/>
+          <w:i w:val="0"/>
+          <w:sz w:val="21"/>
+        </w:rPr>
+        <w:t>not admitted as a formal discriminator</w:t>
+      </w:r>
+      <w:r>
+        <w:rPr>
+          <w:rFonts w:ascii="Times New Roman" w:hAnsi="Times New Roman" w:eastAsia="宋体"/>
+          <w:b w:val="0"/>
+          <w:i w:val="0"/>
+          <w:sz w:val="21"/>
+        </w:rPr>
+        <w:t xml:space="preserve"> (user criterion d&gt;1.5 unmet). Baihua-domain d=−1.07 (same direction, insufficient strength) + shiping d=+0.07 (officialese convergence — consistent with the shiping seven-dim failure precedent). </w:t>
+      </w:r>
+      <w:r>
+        <w:rPr>
+          <w:rFonts w:ascii="Times New Roman" w:hAnsi="Times New Roman" w:eastAsia="宋体"/>
+          <w:b/>
+          <w:i w:val="0"/>
+          <w:sz w:val="21"/>
+        </w:rPr>
+        <w:t>Incremental value retained</w:t>
+      </w:r>
+      <w:r>
+        <w:rPr>
+          <w:rFonts w:ascii="Times New Roman" w:hAnsi="Times New Roman" w:eastAsia="宋体"/>
+          <w:b w:val="0"/>
+          <w:i w:val="0"/>
+          <w:sz w:val="21"/>
+        </w:rPr>
+        <w:t xml:space="preserve">: low redundancy with sent_proj (pooled 0.049 / within-human 0.595) + intervention-space independence (Δ-corr +0.021 — injection does not alter propulsion concentration). </w:t>
+      </w:r>
+      <w:r>
+        <w:rPr>
+          <w:rFonts w:ascii="Times New Roman" w:hAnsi="Times New Roman" w:eastAsia="宋体"/>
+          <w:b/>
+          <w:i w:val="0"/>
+          <w:sz w:val="21"/>
+        </w:rPr>
+        <w:t>Axis stable across corpora</w:t>
+      </w:r>
+      <w:r>
+        <w:rPr>
+          <w:rFonts w:ascii="Times New Roman" w:hAnsi="Times New Roman" w:eastAsia="宋体"/>
+          <w:b w:val="0"/>
+          <w:i w:val="0"/>
+          <w:sz w:val="21"/>
+        </w:rPr>
+        <w:t xml:space="preserve"> (cos |0.99| — discriminator-space inherent structure confirmed). Shrinkage mechanism: independent-set human short texts (5–19 diffs) noise contracting toward the isotropic anchor — direction real, strength insufficient.</w:t>
       </w:r>
     </w:p>
     <w:p>

</xml_diff>

<commit_message>
v0.82: jump mechanism & controllable variables (determinism audit + decoding-strategy analysis + temperature sweep)
- determinism audit: jump detection deterministically correct (no segment-boundary confound, no length bias, jump-dominant dims = axis top-dims, model factor small, semantic = real content turns)
- controllable variables: beam search -39% jump density (9.88->6.04), vt injection +37% (->13.51), temperature NO significant monotonic effect (8-run sweep, Spearman p=0.77)
- mechanism: 'AI jumps less' = sampling determinism + weakened language organization (short clauses/weak reference/half connectives) while lexical diversity HIGHER (0.972 vs 0.963) - 'static lexical diversity vs dynamic trajectory propulsion' separation
- char_diversity x jump-density rho=+0.33 (p<0.001)
- scripts: engine_jump_audit/mechanism/temp_analysis.py + --temperature param in gen_theme_guidance
- papers ZH/EN 6.6 added + docx regenerated

Co-Authored-By: Claude <noreply@anthropic.com>
</commit_message>
<xml_diff>
--- a/论文/Intent-Dynamics-EN.docx
+++ b/论文/Intent-Dynamics-EN.docx
@@ -7641,6 +7641,229 @@
           <w:sz w:val="21"/>
         </w:rPr>
         <w:t xml:space="preserve"> (density d=+1.85 — human 12.1 vs AI 7.7 per 100 clauses — clustering gap 5 vs 9), not jump purity — D_excl guardrail passed (cos 0.999 — no circularity).</w:t>
+      </w:r>
+    </w:p>
+    <w:p>
+      <w:pPr>
+        <w:keepNext/>
+        <w:spacing w:before="160" w:after="100"/>
+      </w:pPr>
+      <w:r>
+        <w:rPr>
+          <w:rFonts w:ascii="Times New Roman" w:hAnsi="Times New Roman" w:eastAsia="黑体"/>
+          <w:b/>
+          <w:i w:val="0"/>
+          <w:sz w:val="25"/>
+        </w:rPr>
+        <w:t>6.6 Jump Mechanism and Controllable Variables (v0.82 — why AI jumps less)</w:t>
+      </w:r>
+    </w:p>
+    <w:p>
+      <w:pPr>
+        <w:spacing w:after="120" w:line="300" w:lineRule="auto"/>
+        <w:ind w:firstLine="420"/>
+      </w:pPr>
+      <w:r>
+        <w:rPr>
+          <w:rFonts w:ascii="Times New Roman" w:hAnsi="Times New Roman" w:eastAsia="宋体"/>
+          <w:b/>
+          <w:i w:val="0"/>
+          <w:sz w:val="21"/>
+        </w:rPr>
+        <w:t>Determinism audit</w:t>
+      </w:r>
+      <w:r>
+        <w:rPr>
+          <w:rFonts w:ascii="Times New Roman" w:hAnsi="Times New Roman" w:eastAsia="宋体"/>
+          <w:b w:val="0"/>
+          <w:i w:val="0"/>
+          <w:sz w:val="21"/>
+        </w:rPr>
+        <w:t xml:space="preserve">: jump detection is deterministically correct — no segment-boundary confound (80%+ of jumps inside segments), no clause-length bias (ρ≈0), </w:t>
+      </w:r>
+      <w:r>
+        <w:rPr>
+          <w:rFonts w:ascii="Times New Roman" w:hAnsi="Times New Roman" w:eastAsia="宋体"/>
+          <w:b/>
+          <w:i w:val="0"/>
+          <w:sz w:val="21"/>
+        </w:rPr>
+        <w:t>jump-dominant dims = [11,13,17,36,42,55...] (identical human/AI — overlapping the axis top-dims — jumps are along-axis propulsion confirmed)</w:t>
+      </w:r>
+      <w:r>
+        <w:rPr>
+          <w:rFonts w:ascii="Times New Roman" w:hAnsi="Times New Roman" w:eastAsia="宋体"/>
+          <w:b w:val="0"/>
+          <w:i w:val="0"/>
+          <w:sz w:val="21"/>
+        </w:rPr>
+        <w:t>, model factor small (DS 7.4 vs Qwen 8.1 per 100 clauses — "AI jumps less" is a paradigm-wide property), semantic validation = real content turns (character introduction / dialogue switch / scene transition).</w:t>
+      </w:r>
+    </w:p>
+    <w:p>
+      <w:pPr>
+        <w:spacing w:after="120" w:line="300" w:lineRule="auto"/>
+        <w:ind w:firstLine="420"/>
+      </w:pPr>
+      <w:r>
+        <w:rPr>
+          <w:rFonts w:ascii="Times New Roman" w:hAnsi="Times New Roman" w:eastAsia="宋体"/>
+          <w:b/>
+          <w:i w:val="0"/>
+          <w:sz w:val="21"/>
+        </w:rPr>
+        <w:t>Controllable variables (mechanism chain closed)</w:t>
+      </w:r>
+      <w:r>
+        <w:rPr>
+          <w:rFonts w:ascii="Times New Roman" w:hAnsi="Times New Roman" w:eastAsia="宋体"/>
+          <w:b w:val="0"/>
+          <w:i w:val="0"/>
+          <w:sz w:val="21"/>
+        </w:rPr>
+        <w:t>:</w:t>
+      </w:r>
+    </w:p>
+    <w:p>
+      <w:pPr>
+        <w:spacing w:after="60" w:line="300" w:lineRule="auto"/>
+      </w:pPr>
+      <w:r>
+        <w:rPr>
+          <w:rFonts w:ascii="Times New Roman" w:hAnsi="Times New Roman" w:eastAsia="宋体"/>
+          <w:b/>
+          <w:i w:val="0"/>
+          <w:sz w:val="20"/>
+        </w:rPr>
+        <w:t>beam search: −39% jump density</w:t>
+      </w:r>
+      <w:r>
+        <w:rPr>
+          <w:rFonts w:ascii="Times New Roman" w:hAnsi="Times New Roman" w:eastAsia="宋体"/>
+          <w:b w:val="0"/>
+          <w:i w:val="0"/>
+          <w:sz w:val="20"/>
+        </w:rPr>
+        <w:t xml:space="preserve"> (9.88→6.04 per 100 clauses — deterministic selection smooths trajectories)</w:t>
+      </w:r>
+    </w:p>
+    <w:p>
+      <w:pPr>
+        <w:spacing w:after="60" w:line="300" w:lineRule="auto"/>
+      </w:pPr>
+      <w:r>
+        <w:rPr>
+          <w:rFonts w:ascii="Times New Roman" w:hAnsi="Times New Roman" w:eastAsia="宋体"/>
+          <w:b/>
+          <w:i w:val="0"/>
+          <w:sz w:val="20"/>
+        </w:rPr>
+        <w:t>vt virtual-token injection: +37%</w:t>
+      </w:r>
+      <w:r>
+        <w:rPr>
+          <w:rFonts w:ascii="Times New Roman" w:hAnsi="Times New Roman" w:eastAsia="宋体"/>
+          <w:b w:val="0"/>
+          <w:i w:val="0"/>
+          <w:sz w:val="20"/>
+        </w:rPr>
+        <w:t xml:space="preserve"> (9.88→13.51)</w:t>
+      </w:r>
+    </w:p>
+    <w:p>
+      <w:pPr>
+        <w:spacing w:after="60" w:line="300" w:lineRule="auto"/>
+      </w:pPr>
+      <w:r>
+        <w:rPr>
+          <w:rFonts w:ascii="Times New Roman" w:hAnsi="Times New Roman" w:eastAsia="宋体"/>
+          <w:b/>
+          <w:i w:val="0"/>
+          <w:sz w:val="20"/>
+        </w:rPr>
+        <w:t>temperature: no significant monotonic effect</w:t>
+      </w:r>
+      <w:r>
+        <w:rPr>
+          <w:rFonts w:ascii="Times New Roman" w:hAnsi="Times New Roman" w:eastAsia="宋体"/>
+          <w:b w:val="0"/>
+          <w:i w:val="0"/>
+          <w:sz w:val="20"/>
+        </w:rPr>
+        <w:t xml:space="preserve"> (8-run sweep 0.6–1.5 — Spearman p=0.77 — non-monotonic — weak/uncertain)</w:t>
+      </w:r>
+    </w:p>
+    <w:p>
+      <w:pPr>
+        <w:spacing w:after="60" w:line="300" w:lineRule="auto"/>
+      </w:pPr>
+      <w:r>
+        <w:rPr>
+          <w:rFonts w:ascii="Times New Roman" w:hAnsi="Times New Roman" w:eastAsia="宋体"/>
+          <w:b/>
+          <w:i w:val="0"/>
+          <w:sz w:val="20"/>
+        </w:rPr>
+        <w:t>Language organization</w:t>
+      </w:r>
+      <w:r>
+        <w:rPr>
+          <w:rFonts w:ascii="Times New Roman" w:hAnsi="Times New Roman" w:eastAsia="宋体"/>
+          <w:b w:val="0"/>
+          <w:i w:val="0"/>
+          <w:sz w:val="20"/>
+        </w:rPr>
+        <w:t xml:space="preserve">: AI clauses shorter (9.9 vs 12.1), fewer pronouns (weak reference chains), half the connectives — yet </w:t>
+      </w:r>
+      <w:r>
+        <w:rPr>
+          <w:rFonts w:ascii="Times New Roman" w:hAnsi="Times New Roman" w:eastAsia="宋体"/>
+          <w:b/>
+          <w:i w:val="0"/>
+          <w:sz w:val="20"/>
+        </w:rPr>
+        <w:t>higher lexical diversity (0.972 vs 0.963) with fewer jumps — "static lexical diversity vs dynamic trajectory propulsion" separation</w:t>
+      </w:r>
+      <w:r>
+        <w:rPr>
+          <w:rFonts w:ascii="Times New Roman" w:hAnsi="Times New Roman" w:eastAsia="宋体"/>
+          <w:b w:val="0"/>
+          <w:i w:val="0"/>
+          <w:sz w:val="20"/>
+        </w:rPr>
+        <w:t xml:space="preserve"> — AI's ornamentation lives in the lexical (static) layer, its propulsion deficit in the trajectory (dynamic) layer — char_diversity×jump-density ρ=+0.33 (p&lt;0.001)</w:t>
+      </w:r>
+    </w:p>
+    <w:p>
+      <w:pPr>
+        <w:spacing w:after="60" w:line="300" w:lineRule="auto"/>
+      </w:pPr>
+      <w:r>
+        <w:rPr>
+          <w:rFonts w:ascii="Times New Roman" w:hAnsi="Times New Roman" w:eastAsia="宋体"/>
+          <w:b/>
+          <w:i w:val="0"/>
+          <w:sz w:val="20"/>
+        </w:rPr>
+        <w:t>Mechanism</w:t>
+      </w:r>
+      <w:r>
+        <w:rPr>
+          <w:rFonts w:ascii="Times New Roman" w:hAnsi="Times New Roman" w:eastAsia="宋体"/>
+          <w:b w:val="0"/>
+          <w:i w:val="0"/>
+          <w:sz w:val="20"/>
+        </w:rPr>
+        <w:t xml:space="preserve">: "AI jumps less" = sampling determinism (beam-class strategies) + weakened language organization (short clauses / weak reference / fewer connectives) → missing trajectory propulsion — controllable variables concentrate in </w:t>
+      </w:r>
+      <w:r>
+        <w:rPr>
+          <w:rFonts w:ascii="Times New Roman" w:hAnsi="Times New Roman" w:eastAsia="宋体"/>
+          <w:b/>
+          <w:i w:val="0"/>
+          <w:sz w:val="20"/>
+        </w:rPr>
+        <w:t>decoding-strategy layer (inference-time — beam/vt injection) and loss terms (training-time — engine todo 4)</w:t>
       </w:r>
     </w:p>
     <w:p>

</xml_diff>

<commit_message>
v0.84: spectrum-feature priority ranking - partially upheld - F1/F3 verified as priority
- user design: 9-feature comparison (F1-F9) for measurable/intervenable/embeddable/trainable features
- S-F1 PASS: strong candidates {F1 alpha-dist d=+1.94, F3 ratio_unit d=-3.18, F7 dfa d=-1.13} - F1/F3 priority VERIFIED
- S-F2 FAIL: F4 lag1 d=-0.31 weak but lag2 d=+1.02 rhythmicity signal (new candidate)
- S-F3 PASS: top-3={F3,F1,F2}
- frequency domain null (F6/F8/F9 d~0 - validates 'do not engineer' expectation)
- F1 direction-sign new signal (mean_signed d=+0.80 - humans advance forward more)
- F2 clarification: perpendicular component no discrimination (d=-0.11)
- review absorbed: direction-sign subfeatures, locked vt_gate_beam contrast, F4 >=15 diff gate, fixed bands, length robustness
- script: engine_spectrum_features.py
- papers ZH/EN 6.6.6 priority table + docx regenerated

Co-Authored-By: Claude <noreply@anthropic.com>
</commit_message>
<xml_diff>
--- a/论文/Intent-Dynamics-EN.docx
+++ b/论文/Intent-Dynamics-EN.docx
@@ -7881,6 +7881,336 @@
           <w:sz w:val="21"/>
         </w:rPr>
         <w:t xml:space="preserve"> — the switch-type distribution itself carries information (most switches are small-angle or return — "thoughts turn less than imagined").</w:t>
+      </w:r>
+    </w:p>
+    <w:p>
+      <w:pPr>
+        <w:keepNext/>
+        <w:spacing w:before="160" w:after="100"/>
+      </w:pPr>
+      <w:r>
+        <w:rPr>
+          <w:rFonts w:ascii="Times New Roman" w:hAnsi="Times New Roman" w:eastAsia="黑体"/>
+          <w:b/>
+          <w:i w:val="0"/>
+          <w:sz w:val="25"/>
+        </w:rPr>
+        <w:t>6.6.6 Spectrum-Feature Priority Ranking (v0.84 — partially upheld — F1/F3 verified as priority)</w:t>
+      </w:r>
+    </w:p>
+    <w:p>
+      <w:pPr>
+        <w:spacing w:after="120" w:line="300" w:lineRule="auto"/>
+        <w:ind w:firstLine="420"/>
+      </w:pPr>
+      <w:r>
+        <w:rPr>
+          <w:rFonts w:ascii="Times New Roman" w:hAnsi="Times New Roman" w:eastAsia="宋体"/>
+          <w:b/>
+          <w:i w:val="0"/>
+          <w:sz w:val="21"/>
+        </w:rPr>
+        <w:t>Task (user design)</w:t>
+      </w:r>
+      <w:r>
+        <w:rPr>
+          <w:rFonts w:ascii="Times New Roman" w:hAnsi="Times New Roman" w:eastAsia="宋体"/>
+          <w:b w:val="0"/>
+          <w:i w:val="0"/>
+          <w:sz w:val="21"/>
+        </w:rPr>
+        <w:t>: systematic comparison of 9 mathematical features (F1 α distribution / F2 ε distribution / F3 ratio_unit / F4 velocity autocorrelation / F5 distribution fit / F6 spectral slope / F7 DFA-Hurst / F8 band energy / F9 spectral entropy) — find features that are measurable/intervenable/embeddable/trainable — four-axis composite (0.4 discrimination + 0.3 intervention + 0.2 embedding + 0.1 training) — criteria S-F1..F3 preregistered.</w:t>
+      </w:r>
+    </w:p>
+    <w:p>
+      <w:pPr>
+        <w:spacing w:after="120" w:line="300" w:lineRule="auto"/>
+        <w:ind w:firstLine="420"/>
+      </w:pPr>
+      <w:r>
+        <w:rPr>
+          <w:rFonts w:ascii="Times New Roman" w:hAnsi="Times New Roman" w:eastAsia="宋体"/>
+          <w:b/>
+          <w:i w:val="0"/>
+          <w:sz w:val="21"/>
+        </w:rPr>
+        <w:t>Verdict (partially upheld)</w:t>
+      </w:r>
+      <w:r>
+        <w:rPr>
+          <w:rFonts w:ascii="Times New Roman" w:hAnsi="Times New Roman" w:eastAsia="宋体"/>
+          <w:b w:val="0"/>
+          <w:i w:val="0"/>
+          <w:sz w:val="21"/>
+        </w:rPr>
+        <w:t xml:space="preserve">: </w:t>
+      </w:r>
+      <w:r>
+        <w:rPr>
+          <w:rFonts w:ascii="Times New Roman" w:hAnsi="Times New Roman" w:eastAsia="宋体"/>
+          <w:b/>
+          <w:i w:val="0"/>
+          <w:sz w:val="21"/>
+        </w:rPr>
+        <w:t>S-F1 PASS</w:t>
+      </w:r>
+      <w:r>
+        <w:rPr>
+          <w:rFonts w:ascii="Times New Roman" w:hAnsi="Times New Roman" w:eastAsia="宋体"/>
+          <w:b w:val="0"/>
+          <w:i w:val="0"/>
+          <w:sz w:val="21"/>
+        </w:rPr>
+        <w:t xml:space="preserve"> (strong candidates {F1 d=+1.94, F3 d=−3.18, F7 dfa d=−1.13} — F1/F3 priority verified); </w:t>
+      </w:r>
+      <w:r>
+        <w:rPr>
+          <w:rFonts w:ascii="Times New Roman" w:hAnsi="Times New Roman" w:eastAsia="宋体"/>
+          <w:b/>
+          <w:i w:val="0"/>
+          <w:sz w:val="21"/>
+        </w:rPr>
+        <w:t>S-F2 FAIL</w:t>
+      </w:r>
+      <w:r>
+        <w:rPr>
+          <w:rFonts w:ascii="Times New Roman" w:hAnsi="Times New Roman" w:eastAsia="宋体"/>
+          <w:b w:val="0"/>
+          <w:i w:val="0"/>
+          <w:sz w:val="21"/>
+        </w:rPr>
+        <w:t xml:space="preserve"> (F4 lag1 d=−0.31 — "thinking inertia" weak — but </w:t>
+      </w:r>
+      <w:r>
+        <w:rPr>
+          <w:rFonts w:ascii="Times New Roman" w:hAnsi="Times New Roman" w:eastAsia="宋体"/>
+          <w:b/>
+          <w:i w:val="0"/>
+          <w:sz w:val="21"/>
+        </w:rPr>
+        <w:t>lag2 d=+1.02 rhythmicity signal</w:t>
+      </w:r>
+      <w:r>
+        <w:rPr>
+          <w:rFonts w:ascii="Times New Roman" w:hAnsi="Times New Roman" w:eastAsia="宋体"/>
+          <w:b w:val="0"/>
+          <w:i w:val="0"/>
+          <w:sz w:val="21"/>
+        </w:rPr>
+        <w:t xml:space="preserve">); </w:t>
+      </w:r>
+      <w:r>
+        <w:rPr>
+          <w:rFonts w:ascii="Times New Roman" w:hAnsi="Times New Roman" w:eastAsia="宋体"/>
+          <w:b/>
+          <w:i w:val="0"/>
+          <w:sz w:val="21"/>
+        </w:rPr>
+        <w:t>S-F3 PASS</w:t>
+      </w:r>
+      <w:r>
+        <w:rPr>
+          <w:rFonts w:ascii="Times New Roman" w:hAnsi="Times New Roman" w:eastAsia="宋体"/>
+          <w:b w:val="0"/>
+          <w:i w:val="0"/>
+          <w:sz w:val="21"/>
+        </w:rPr>
+        <w:t xml:space="preserve"> (top-3={F3,F1,F2}).</w:t>
+      </w:r>
+    </w:p>
+    <w:p>
+      <w:pPr>
+        <w:spacing w:after="120" w:line="300" w:lineRule="auto"/>
+        <w:ind w:firstLine="420"/>
+      </w:pPr>
+      <w:r>
+        <w:rPr>
+          <w:rFonts w:ascii="Times New Roman" w:hAnsi="Times New Roman" w:eastAsia="宋体"/>
+          <w:b/>
+          <w:i w:val="0"/>
+          <w:sz w:val="21"/>
+        </w:rPr>
+        <w:t>Priority ranking (guides subsequent experiments)</w:t>
+      </w:r>
+      <w:r>
+        <w:rPr>
+          <w:rFonts w:ascii="Times New Roman" w:hAnsi="Times New Roman" w:eastAsia="宋体"/>
+          <w:b w:val="0"/>
+          <w:i w:val="0"/>
+          <w:sz w:val="21"/>
+        </w:rPr>
+        <w:t>:</w:t>
+      </w:r>
+    </w:p>
+    <w:p>
+      <w:pPr>
+        <w:spacing w:after="60" w:line="300" w:lineRule="auto"/>
+      </w:pPr>
+      <w:r>
+        <w:rPr>
+          <w:rFonts w:ascii="Times New Roman" w:hAnsi="Times New Roman" w:eastAsia="宋体"/>
+          <w:b/>
+          <w:i w:val="0"/>
+          <w:sz w:val="20"/>
+        </w:rPr>
+        <w:t>F3 ratio_unit (0.90)</w:t>
+      </w:r>
+      <w:r>
+        <w:rPr>
+          <w:rFonts w:ascii="Times New Roman" w:hAnsi="Times New Roman" w:eastAsia="宋体"/>
+          <w:b w:val="0"/>
+          <w:i w:val="0"/>
+          <w:sz w:val="20"/>
+        </w:rPr>
+        <w:t xml:space="preserve"> — propulsion concentration — strongest d but shrinks on the independent set (v0.80 direction retained)</w:t>
+      </w:r>
+    </w:p>
+    <w:p>
+      <w:pPr>
+        <w:spacing w:after="60" w:line="300" w:lineRule="auto"/>
+      </w:pPr>
+      <w:r>
+        <w:rPr>
+          <w:rFonts w:ascii="Times New Roman" w:hAnsi="Times New Roman" w:eastAsia="宋体"/>
+          <w:b/>
+          <w:i w:val="0"/>
+          <w:sz w:val="20"/>
+        </w:rPr>
+        <w:t>F1 α distribution (0.76)</w:t>
+      </w:r>
+      <w:r>
+        <w:rPr>
+          <w:rFonts w:ascii="Times New Roman" w:hAnsi="Times New Roman" w:eastAsia="宋体"/>
+          <w:b w:val="0"/>
+          <w:i w:val="0"/>
+          <w:sz w:val="20"/>
+        </w:rPr>
+        <w:t xml:space="preserve"> — along-axis propulsion — stable strong candidate (same source as jump) — </w:t>
+      </w:r>
+      <w:r>
+        <w:rPr>
+          <w:rFonts w:ascii="Times New Roman" w:hAnsi="Times New Roman" w:eastAsia="宋体"/>
+          <w:b/>
+          <w:i w:val="0"/>
+          <w:sz w:val="20"/>
+        </w:rPr>
+        <w:t>F1_mean_signed d=+0.80 (humans advance forward more — direction preference is a signal beyond magnitude)</w:t>
+      </w:r>
+    </w:p>
+    <w:p>
+      <w:pPr>
+        <w:spacing w:after="60" w:line="300" w:lineRule="auto"/>
+      </w:pPr>
+      <w:r>
+        <w:rPr>
+          <w:rFonts w:ascii="Times New Roman" w:hAnsi="Times New Roman" w:eastAsia="宋体"/>
+          <w:b/>
+          <w:i w:val="0"/>
+          <w:sz w:val="20"/>
+        </w:rPr>
+        <w:t>F2 ε distribution (0.52)</w:t>
+      </w:r>
+      <w:r>
+        <w:rPr>
+          <w:rFonts w:ascii="Times New Roman" w:hAnsi="Times New Roman" w:eastAsia="宋体"/>
+          <w:b w:val="0"/>
+          <w:i w:val="0"/>
+          <w:sz w:val="20"/>
+        </w:rPr>
+        <w:t xml:space="preserve"> — perpendicular component has NO discrimination (d=−0.11 — ratio_unit's power comes from the parallel component) — constraint only</w:t>
+      </w:r>
+    </w:p>
+    <w:p>
+      <w:pPr>
+        <w:spacing w:after="60" w:line="300" w:lineRule="auto"/>
+      </w:pPr>
+      <w:r>
+        <w:rPr>
+          <w:rFonts w:ascii="Times New Roman" w:hAnsi="Times New Roman" w:eastAsia="宋体"/>
+          <w:b/>
+          <w:i w:val="0"/>
+          <w:sz w:val="20"/>
+        </w:rPr>
+        <w:t>F4 autocorrelation (0.41)</w:t>
+      </w:r>
+      <w:r>
+        <w:rPr>
+          <w:rFonts w:ascii="Times New Roman" w:hAnsi="Times New Roman" w:eastAsia="宋体"/>
+          <w:b w:val="0"/>
+          <w:i w:val="0"/>
+          <w:sz w:val="20"/>
+        </w:rPr>
+        <w:t xml:space="preserve"> — lag2 d=+1.02 rhythmicity candidate (pending independent validation)</w:t>
+      </w:r>
+    </w:p>
+    <w:p>
+      <w:pPr>
+        <w:spacing w:after="60" w:line="300" w:lineRule="auto"/>
+      </w:pPr>
+      <w:r>
+        <w:rPr>
+          <w:rFonts w:ascii="Times New Roman" w:hAnsi="Times New Roman" w:eastAsia="宋体"/>
+          <w:b/>
+          <w:i w:val="0"/>
+          <w:sz w:val="20"/>
+        </w:rPr>
+        <w:t>F7 DFA/Hurst (0.32)</w:t>
+      </w:r>
+      <w:r>
+        <w:rPr>
+          <w:rFonts w:ascii="Times New Roman" w:hAnsi="Times New Roman" w:eastAsia="宋体"/>
+          <w:b w:val="0"/>
+          <w:i w:val="0"/>
+          <w:sz w:val="20"/>
+        </w:rPr>
+        <w:t xml:space="preserve"> — d=−1.13 but scaling exponent questionable (short-series bias — α_D=0.03 implausibly low)</w:t>
+      </w:r>
+    </w:p>
+    <w:p>
+      <w:pPr>
+        <w:spacing w:after="60" w:line="300" w:lineRule="auto"/>
+      </w:pPr>
+      <w:r>
+        <w:rPr>
+          <w:rFonts w:ascii="Times New Roman" w:hAnsi="Times New Roman" w:eastAsia="宋体"/>
+          <w:b/>
+          <w:i w:val="0"/>
+          <w:sz w:val="20"/>
+        </w:rPr>
+        <w:t>Frequency domain null</w:t>
+      </w:r>
+      <w:r>
+        <w:rPr>
+          <w:rFonts w:ascii="Times New Roman" w:hAnsi="Times New Roman" w:eastAsia="宋体"/>
+          <w:b w:val="0"/>
+          <w:i w:val="0"/>
+          <w:sz w:val="20"/>
+        </w:rPr>
+        <w:t xml:space="preserve"> (F6/F8/F9 d≈0 — validates "do not engineer frequency features")</w:t>
+      </w:r>
+    </w:p>
+    <w:p>
+      <w:pPr>
+        <w:spacing w:after="120" w:line="300" w:lineRule="auto"/>
+        <w:ind w:firstLine="420"/>
+      </w:pPr>
+      <w:r>
+        <w:rPr>
+          <w:rFonts w:ascii="Times New Roman" w:hAnsi="Times New Roman" w:eastAsia="宋体"/>
+          <w:b/>
+          <w:i w:val="0"/>
+          <w:sz w:val="21"/>
+        </w:rPr>
+        <w:t>Method</w:t>
+      </w:r>
+      <w:r>
+        <w:rPr>
+          <w:rFonts w:ascii="Times New Roman" w:hAnsi="Times New Roman" w:eastAsia="宋体"/>
+          <w:b w:val="0"/>
+          <w:i w:val="0"/>
+          <w:sz w:val="21"/>
+        </w:rPr>
+        <w:t>: intervention evidence from 201 existing runs offline (vt_gate_beam primary contrast — zero new generation); BH-FDR multiple-comparison correction; preregistered fixed bands; F1 direction-sign subfeatures (review absorbed).</w:t>
       </w:r>
     </w:p>
     <w:p>

</xml_diff>

<commit_message>
v0.85-3: math geometry pre-test - bin-mapping fix -> minimum threshold PASSED (operator semantics independent structure)
- round 1 (raw digits): separability driven by C-range distribution (placeholder baseline 0.927 vs true 0.990) - NEGATED
- round 2 (bin-mapping fix: digits->small/medium/large): DECISIVE REVERSAL - true words sil=0.551 vs placeholder 0.188 - Delta sil=+0.363 far above criterion - M-A1 PASS - user condition exactly met: after digit masking true-word four classes still separate AND exceed placeholder baseline - operator semantics HAS independent geometric structure
- mechanism: digit-range differences masked the operator-semantics contribution; bin-mapping strips surface features
- full-masking lesson: within-class zero variance (sil=1.0 template degeneration - bin-mapping preserves diversity)
- papers ZH/EN 6.6.7 updated to reversal + docx regenerated

Co-Authored-By: Claude <noreply@anthropic.com>
</commit_message>
<xml_diff>
--- a/论文/Intent-Dynamics-EN.docx
+++ b/论文/Intent-Dynamics-EN.docx
@@ -8249,7 +8249,7 @@
           <w:i w:val="0"/>
           <w:sz w:val="21"/>
         </w:rPr>
-        <w:t xml:space="preserve">: do math-operation symbol/digit combinations have distinguishable geometric structure in intent space? </w:t>
+        <w:t xml:space="preserve">: do math-operation symbol/digit combinations have distinguishable geometric structure in intent space? — 4 operation classes (add/sub/mul/div × 24 — seed 2026) — structured transcription — bge→fingerprint — </w:t>
       </w:r>
       <w:r>
         <w:rPr>
@@ -8258,7 +8258,7 @@
           <w:i w:val="0"/>
           <w:sz w:val="21"/>
         </w:rPr>
-        <w:t>Pre-test (minimum threshold) NEGATED</w:t>
+        <w:t>placeholder-word baseline control</w:t>
       </w:r>
       <w:r>
         <w:rPr>
@@ -8267,25 +8267,7 @@
           <w:i w:val="0"/>
           <w:sz w:val="21"/>
         </w:rPr>
-        <w:t xml:space="preserve">: 4 operation classes (add/sub/mul/div × 24 — seed 2026) — structured transcription — bge→fingerprint — </w:t>
-      </w:r>
-      <w:r>
-        <w:rPr>
-          <w:rFonts w:ascii="Times New Roman" w:hAnsi="Times New Roman" w:eastAsia="宋体"/>
-          <w:b/>
-          <w:i w:val="0"/>
-          <w:sz w:val="21"/>
-        </w:rPr>
-        <w:t>placeholder-word baseline control</w:t>
-      </w:r>
-      <w:r>
-        <w:rPr>
-          <w:rFonts w:ascii="Times New Roman" w:hAnsi="Times New Roman" w:eastAsia="宋体"/>
-          <w:b w:val="0"/>
-          <w:i w:val="0"/>
-          <w:sz w:val="21"/>
-        </w:rPr>
-        <w:t xml:space="preserve"> (甲/乙/丙/丁→random pinyin replacing operator words — same template same digits).</w:t>
+        <w:t xml:space="preserve"> (lexical classification trap).</w:t>
       </w:r>
     </w:p>
     <w:p>
@@ -8300,7 +8282,7 @@
           <w:i w:val="0"/>
           <w:sz w:val="21"/>
         </w:rPr>
-        <w:t>Result</w:t>
+        <w:t>Round 1 (raw digits)</w:t>
       </w:r>
       <w:r>
         <w:rPr>
@@ -8309,7 +8291,7 @@
           <w:i w:val="0"/>
           <w:sz w:val="21"/>
         </w:rPr>
-        <w:t xml:space="preserve">: operation texts are highly separable (LDA acc 0.990) — </w:t>
+        <w:t xml:space="preserve">: operation texts highly separable (LDA acc 0.990) — </w:t>
       </w:r>
       <w:r>
         <w:rPr>
@@ -8318,7 +8300,7 @@
           <w:i w:val="0"/>
           <w:sz w:val="21"/>
         </w:rPr>
-        <w:t>but the placeholder baseline is also separable (0.927) — Δacc=+0.06 fails the 0.15 criterion</w:t>
+        <w:t>but the placeholder baseline also separable (0.927) — Δacc=+0.06 fails the line</w:t>
       </w:r>
       <w:r>
         <w:rPr>
@@ -8327,7 +8309,7 @@
           <w:i w:val="0"/>
           <w:sz w:val="21"/>
         </w:rPr>
-        <w:t xml:space="preserve"> — silhouette Δ=+0.02 (&lt;0.10) — </w:t>
+        <w:t xml:space="preserve"> — </w:t>
       </w:r>
       <w:r>
         <w:rPr>
@@ -8336,7 +8318,7 @@
           <w:i w:val="0"/>
           <w:sz w:val="21"/>
         </w:rPr>
-        <w:t>four-class separability is driven mainly by C-range distribution</w:t>
+        <w:t>separability driven mainly by C-range distribution</w:t>
       </w:r>
       <w:r>
         <w:rPr>
@@ -8345,8 +8327,14 @@
           <w:i w:val="0"/>
           <w:sz w:val="21"/>
         </w:rPr>
-        <w:t xml:space="preserve"> (add [40,165]/sub [2,78]/mul [110,8366]/div [1,32] — BGE sensitive to numeric magnitude — digit surface features) — </w:t>
-      </w:r>
+        <w:t xml:space="preserve"> (add [40,165]/sub [2,78]/mul [110,8366]/div [1,32] — BGE numeric sensitivity — digit surface features) — operator-semantics increment not evidenced.</w:t>
+      </w:r>
+    </w:p>
+    <w:p>
+      <w:pPr>
+        <w:spacing w:after="120" w:line="300" w:lineRule="auto"/>
+        <w:ind w:firstLine="420"/>
+      </w:pPr>
       <w:r>
         <w:rPr>
           <w:rFonts w:ascii="Times New Roman" w:hAnsi="Times New Roman" w:eastAsia="宋体"/>
@@ -8354,7 +8342,7 @@
           <w:i w:val="0"/>
           <w:sz w:val="21"/>
         </w:rPr>
-        <w:t>no evidence for operator-semantics incremental contribution — minimum threshold not met — not worth continuing as planned</w:t>
+        <w:t>Round 2 (bin-mapping fix — digits→small/medium/large 3 bins — removes range differences, preserves within-class diversity) — decisive reversal</w:t>
       </w:r>
       <w:r>
         <w:rPr>
@@ -8363,8 +8351,324 @@
           <w:i w:val="0"/>
           <w:sz w:val="21"/>
         </w:rPr>
-        <w:t xml:space="preserve">. Permutation test shows real structure (p&lt;0.001) but of the digit-combination-distribution kind. Methodological value: </w:t>
-      </w:r>
+        <w:t>:</w:t>
+      </w:r>
+    </w:p>
+    <w:tbl>
+      <w:tblPr>
+        <w:tblStyle w:val="TableGrid"/>
+        <w:tblW w:type="auto" w:w="0"/>
+        <w:jc w:val="center"/>
+        <w:tblLook w:firstColumn="1" w:firstRow="1" w:lastColumn="0" w:lastRow="0" w:noHBand="0" w:noVBand="1" w:val="04A0"/>
+      </w:tblPr>
+      <w:tblGrid>
+        <w:gridCol w:w="2268"/>
+        <w:gridCol w:w="2268"/>
+        <w:gridCol w:w="2268"/>
+        <w:gridCol w:w="2268"/>
+      </w:tblGrid>
+      <w:tr>
+        <w:tc>
+          <w:tcPr>
+            <w:tcW w:type="dxa" w:w="2268"/>
+            <w:shd w:val="clear" w:fill="E8EEF7"/>
+          </w:tcPr>
+          <w:p>
+            <w:pPr>
+              <w:jc w:val="center"/>
+            </w:pPr>
+            <w:r/>
+            <w:r>
+              <w:rPr>
+                <w:rFonts w:ascii="Times New Roman" w:hAnsi="Times New Roman" w:eastAsia="黑体"/>
+                <w:b/>
+                <w:i w:val="0"/>
+                <w:sz w:val="17"/>
+              </w:rPr>
+              <w:t>metric</w:t>
+            </w:r>
+          </w:p>
+        </w:tc>
+        <w:tc>
+          <w:tcPr>
+            <w:tcW w:type="dxa" w:w="2268"/>
+            <w:shd w:val="clear" w:fill="E8EEF7"/>
+          </w:tcPr>
+          <w:p>
+            <w:pPr>
+              <w:jc w:val="center"/>
+            </w:pPr>
+            <w:r/>
+            <w:r>
+              <w:rPr>
+                <w:rFonts w:ascii="Times New Roman" w:hAnsi="Times New Roman" w:eastAsia="黑体"/>
+                <w:b/>
+                <w:i w:val="0"/>
+                <w:sz w:val="17"/>
+              </w:rPr>
+              <w:t>true words</w:t>
+            </w:r>
+          </w:p>
+        </w:tc>
+        <w:tc>
+          <w:tcPr>
+            <w:tcW w:type="dxa" w:w="2268"/>
+            <w:shd w:val="clear" w:fill="E8EEF7"/>
+          </w:tcPr>
+          <w:p>
+            <w:pPr>
+              <w:jc w:val="center"/>
+            </w:pPr>
+            <w:r/>
+            <w:r>
+              <w:rPr>
+                <w:rFonts w:ascii="Times New Roman" w:hAnsi="Times New Roman" w:eastAsia="黑体"/>
+                <w:b/>
+                <w:i w:val="0"/>
+                <w:sz w:val="17"/>
+              </w:rPr>
+              <w:t>placeholder baseline</w:t>
+            </w:r>
+          </w:p>
+        </w:tc>
+        <w:tc>
+          <w:tcPr>
+            <w:tcW w:type="dxa" w:w="2268"/>
+            <w:shd w:val="clear" w:fill="E8EEF7"/>
+          </w:tcPr>
+          <w:p>
+            <w:pPr>
+              <w:jc w:val="center"/>
+            </w:pPr>
+            <w:r/>
+            <w:r>
+              <w:rPr>
+                <w:rFonts w:ascii="Times New Roman" w:hAnsi="Times New Roman" w:eastAsia="黑体"/>
+                <w:b/>
+                <w:i w:val="0"/>
+                <w:sz w:val="17"/>
+              </w:rPr>
+              <w:t>Δ</w:t>
+            </w:r>
+          </w:p>
+        </w:tc>
+      </w:tr>
+      <w:tr>
+        <w:tc>
+          <w:tcPr>
+            <w:tcW w:type="dxa" w:w="2268"/>
+          </w:tcPr>
+          <w:p>
+            <w:r/>
+            <w:r>
+              <w:rPr>
+                <w:rFonts w:ascii="Times New Roman" w:hAnsi="Times New Roman" w:eastAsia="宋体"/>
+                <w:b w:val="0"/>
+                <w:i w:val="0"/>
+                <w:sz w:val="16"/>
+              </w:rPr>
+              <w:t>silhouette</w:t>
+            </w:r>
+          </w:p>
+        </w:tc>
+        <w:tc>
+          <w:tcPr>
+            <w:tcW w:type="dxa" w:w="2268"/>
+          </w:tcPr>
+          <w:p>
+            <w:r/>
+            <w:r>
+              <w:rPr>
+                <w:rFonts w:ascii="Times New Roman" w:hAnsi="Times New Roman" w:eastAsia="宋体"/>
+                <w:b/>
+                <w:i w:val="0"/>
+                <w:sz w:val="16"/>
+              </w:rPr>
+              <w:t>0.551</w:t>
+            </w:r>
+          </w:p>
+        </w:tc>
+        <w:tc>
+          <w:tcPr>
+            <w:tcW w:type="dxa" w:w="2268"/>
+          </w:tcPr>
+          <w:p>
+            <w:r/>
+            <w:r>
+              <w:rPr>
+                <w:rFonts w:ascii="Times New Roman" w:hAnsi="Times New Roman" w:eastAsia="宋体"/>
+                <w:b w:val="0"/>
+                <w:i w:val="0"/>
+                <w:sz w:val="16"/>
+              </w:rPr>
+              <w:t>0.188</w:t>
+            </w:r>
+          </w:p>
+        </w:tc>
+        <w:tc>
+          <w:tcPr>
+            <w:tcW w:type="dxa" w:w="2268"/>
+          </w:tcPr>
+          <w:p>
+            <w:r/>
+            <w:r>
+              <w:rPr>
+                <w:rFonts w:ascii="Times New Roman" w:hAnsi="Times New Roman" w:eastAsia="宋体"/>
+                <w:b/>
+                <w:i w:val="0"/>
+                <w:sz w:val="16"/>
+              </w:rPr>
+              <w:t>+0.363</w:t>
+            </w:r>
+          </w:p>
+        </w:tc>
+      </w:tr>
+      <w:tr>
+        <w:tc>
+          <w:tcPr>
+            <w:tcW w:type="dxa" w:w="2268"/>
+          </w:tcPr>
+          <w:p>
+            <w:r/>
+            <w:r>
+              <w:rPr>
+                <w:rFonts w:ascii="Times New Roman" w:hAnsi="Times New Roman" w:eastAsia="宋体"/>
+                <w:b w:val="0"/>
+                <w:i w:val="0"/>
+                <w:sz w:val="16"/>
+              </w:rPr>
+              <w:t>LDA acc</w:t>
+            </w:r>
+          </w:p>
+        </w:tc>
+        <w:tc>
+          <w:tcPr>
+            <w:tcW w:type="dxa" w:w="2268"/>
+          </w:tcPr>
+          <w:p>
+            <w:r/>
+            <w:r>
+              <w:rPr>
+                <w:rFonts w:ascii="Times New Roman" w:hAnsi="Times New Roman" w:eastAsia="宋体"/>
+                <w:b w:val="0"/>
+                <w:i w:val="0"/>
+                <w:sz w:val="16"/>
+              </w:rPr>
+              <w:t>1.000</w:t>
+            </w:r>
+          </w:p>
+        </w:tc>
+        <w:tc>
+          <w:tcPr>
+            <w:tcW w:type="dxa" w:w="2268"/>
+          </w:tcPr>
+          <w:p>
+            <w:r/>
+            <w:r>
+              <w:rPr>
+                <w:rFonts w:ascii="Times New Roman" w:hAnsi="Times New Roman" w:eastAsia="宋体"/>
+                <w:b w:val="0"/>
+                <w:i w:val="0"/>
+                <w:sz w:val="16"/>
+              </w:rPr>
+              <w:t>1.000</w:t>
+            </w:r>
+          </w:p>
+        </w:tc>
+        <w:tc>
+          <w:tcPr>
+            <w:tcW w:type="dxa" w:w="2268"/>
+          </w:tcPr>
+          <w:p>
+            <w:r/>
+            <w:r>
+              <w:rPr>
+                <w:rFonts w:ascii="Times New Roman" w:hAnsi="Times New Roman" w:eastAsia="宋体"/>
+                <w:b w:val="0"/>
+                <w:i w:val="0"/>
+                <w:sz w:val="16"/>
+              </w:rPr>
+              <w:t>0.000 (saturated)</w:t>
+            </w:r>
+          </w:p>
+        </w:tc>
+      </w:tr>
+      <w:tr>
+        <w:tc>
+          <w:tcPr>
+            <w:tcW w:type="dxa" w:w="2268"/>
+          </w:tcPr>
+          <w:p>
+            <w:r/>
+            <w:r>
+              <w:rPr>
+                <w:rFonts w:ascii="Times New Roman" w:hAnsi="Times New Roman" w:eastAsia="宋体"/>
+                <w:b w:val="0"/>
+                <w:i w:val="0"/>
+                <w:sz w:val="16"/>
+              </w:rPr>
+              <w:t>permutation</w:t>
+            </w:r>
+          </w:p>
+        </w:tc>
+        <w:tc>
+          <w:tcPr>
+            <w:tcW w:type="dxa" w:w="2268"/>
+          </w:tcPr>
+          <w:p>
+            <w:r/>
+            <w:r>
+              <w:rPr>
+                <w:rFonts w:ascii="Times New Roman" w:hAnsi="Times New Roman" w:eastAsia="宋体"/>
+                <w:b w:val="0"/>
+                <w:i w:val="0"/>
+                <w:sz w:val="16"/>
+              </w:rPr>
+              <w:t>p&lt;0.001</w:t>
+            </w:r>
+          </w:p>
+        </w:tc>
+        <w:tc>
+          <w:tcPr>
+            <w:tcW w:type="dxa" w:w="2268"/>
+          </w:tcPr>
+          <w:p>
+            <w:r/>
+            <w:r>
+              <w:rPr>
+                <w:rFonts w:ascii="Times New Roman" w:hAnsi="Times New Roman" w:eastAsia="宋体"/>
+                <w:b w:val="0"/>
+                <w:i w:val="0"/>
+                <w:sz w:val="16"/>
+              </w:rPr>
+              <w:t>—</w:t>
+            </w:r>
+          </w:p>
+        </w:tc>
+        <w:tc>
+          <w:tcPr>
+            <w:tcW w:type="dxa" w:w="2268"/>
+          </w:tcPr>
+          <w:p>
+            <w:r/>
+            <w:r>
+              <w:rPr>
+                <w:rFonts w:ascii="Times New Roman" w:hAnsi="Times New Roman" w:eastAsia="宋体"/>
+                <w:b w:val="0"/>
+                <w:i w:val="0"/>
+                <w:sz w:val="16"/>
+              </w:rPr>
+              <w:t>—</w:t>
+            </w:r>
+          </w:p>
+        </w:tc>
+      </w:tr>
+    </w:tbl>
+    <w:p>
+      <w:pPr>
+        <w:spacing w:after="120" w:line="300" w:lineRule="auto"/>
+        <w:ind w:firstLine="420"/>
+      </w:pPr>
       <w:r>
         <w:rPr>
           <w:rFonts w:ascii="Times New Roman" w:hAnsi="Times New Roman" w:eastAsia="宋体"/>
@@ -8372,7 +8676,7 @@
           <w:i w:val="0"/>
           <w:sz w:val="21"/>
         </w:rPr>
-        <w:t>the placeholder baseline is the standard control for the "lexical classification trap"</w:t>
+        <w:t>Binned M-A1 PASS</w:t>
       </w:r>
       <w:r>
         <w:rPr>
@@ -8381,7 +8685,61 @@
           <w:i w:val="0"/>
           <w:sz w:val="21"/>
         </w:rPr>
-        <w:t xml:space="preserve"> (any template-classification experiment must add it) — digit range is an inherent confound of symbolic text (same-range paired design is the prerequisite for continuation).</w:t>
+        <w:t xml:space="preserve"> (sil=0.551&gt;0.25 ∧ Δsil=+0.363&gt;0.10 ∧ permutation significant) — </w:t>
+      </w:r>
+      <w:r>
+        <w:rPr>
+          <w:rFonts w:ascii="Times New Roman" w:hAnsi="Times New Roman" w:eastAsia="宋体"/>
+          <w:b/>
+          <w:i w:val="0"/>
+          <w:sz w:val="21"/>
+        </w:rPr>
+        <w:t>the user's condition is exactly met: "after digit masking, the true-word four classes still separate AND exceed the placeholder baseline — operator semantics does have independent geometric structure"</w:t>
+      </w:r>
+      <w:r>
+        <w:rPr>
+          <w:rFonts w:ascii="Times New Roman" w:hAnsi="Times New Roman" w:eastAsia="宋体"/>
+          <w:b w:val="0"/>
+          <w:i w:val="0"/>
+          <w:sz w:val="21"/>
+        </w:rPr>
+        <w:t xml:space="preserve">. Mechanism: digit-range differences are a strong surface feature (masking the operator-semantics contribution) — bin-mapping strips the surface feature — </w:t>
+      </w:r>
+      <w:r>
+        <w:rPr>
+          <w:rFonts w:ascii="Times New Roman" w:hAnsi="Times New Roman" w:eastAsia="宋体"/>
+          <w:b/>
+          <w:i w:val="0"/>
+          <w:sz w:val="21"/>
+        </w:rPr>
+        <w:t>the operator semantics' independent separation emerges clearly (sil Δ=+0.363) — minimum threshold passed — the formal "math-logical intent" analysis is worth launching</w:t>
+      </w:r>
+      <w:r>
+        <w:rPr>
+          <w:rFonts w:ascii="Times New Roman" w:hAnsi="Times New Roman" w:eastAsia="宋体"/>
+          <w:b w:val="0"/>
+          <w:i w:val="0"/>
+          <w:sz w:val="21"/>
+        </w:rPr>
+        <w:t xml:space="preserve"> (real derivation trajectories / higher-math composition need subsequent validation). Methodological value: </w:t>
+      </w:r>
+      <w:r>
+        <w:rPr>
+          <w:rFonts w:ascii="Times New Roman" w:hAnsi="Times New Roman" w:eastAsia="宋体"/>
+          <w:b/>
+          <w:i w:val="0"/>
+          <w:sz w:val="21"/>
+        </w:rPr>
+        <w:t>digit bin-mapping = the standard fix for removing numeric surface features in symbolic-text classification experiments</w:t>
+      </w:r>
+      <w:r>
+        <w:rPr>
+          <w:rFonts w:ascii="Times New Roman" w:hAnsi="Times New Roman" w:eastAsia="宋体"/>
+          <w:b w:val="0"/>
+          <w:i w:val="0"/>
+          <w:sz w:val="21"/>
+        </w:rPr>
+        <w:t>; full masking collapses within-class variance (template degeneration — sil=1.0 mathematically forced — bin-mapping preserves within-class diversity).</w:t>
       </w:r>
     </w:p>
     <w:p>

</xml_diff>

<commit_message>
v0.86: mainline F1/F3 beam-selection intervention (F1 effective +3.2%, F3 not) + math side-line consolidation
- mainline (GPU 6 pairs): F1 along-axis propulsion 1.267->1.307 (+3.2% - direction effective); sent_proj not degraded (0.893->0.883); F3 not effective (ratio_unit up - no operating room)
- conclusion: F1 usable as beam-scoring feature (mild); training-time F1 distribution loss remains the main path for organizational layer
- impl lessons: beam_score merge bug (alpha-type), clause-split exception (split_subclauses fix 60%->0), short-segment F1 scale shift
- side-line 1: bin-mapping robustness 4/4 PASS (cut/binning insensitive); normalized-decimal FAIL (vmax under-coverage design flaw)
- side-line 2: real derivation texts 1/3 PASS (vertical arithmetic positive; applications/equations digit-pattern driven)
- side-line 3: trajectory-feature data gap (single math texts too short)
- papers ZH/EN 6.6.8/6.6.9 + docx regenerated

Co-Authored-By: Claude <noreply@anthropic.com>
</commit_message>
<xml_diff>
--- a/论文/Intent-Dynamics-EN.docx
+++ b/论文/Intent-Dynamics-EN.docx
@@ -8740,6 +8740,332 @@
           <w:sz w:val="21"/>
         </w:rPr>
         <w:t>; full masking collapses within-class variance (template degeneration — sil=1.0 mathematically forced — bin-mapping preserves within-class diversity).</w:t>
+      </w:r>
+    </w:p>
+    <w:p>
+      <w:pPr>
+        <w:keepNext/>
+        <w:spacing w:before="160" w:after="100"/>
+      </w:pPr>
+      <w:r>
+        <w:rPr>
+          <w:rFonts w:ascii="Times New Roman" w:hAnsi="Times New Roman" w:eastAsia="黑体"/>
+          <w:b/>
+          <w:i w:val="0"/>
+          <w:sz w:val="25"/>
+        </w:rPr>
+        <w:t>6.6.8 Mainline: F1/F3 beam-selection intervention (v0.85-6 — F1 direction effective — F3 not)</w:t>
+      </w:r>
+    </w:p>
+    <w:p>
+      <w:pPr>
+        <w:spacing w:after="120" w:line="300" w:lineRule="auto"/>
+        <w:ind w:firstLine="420"/>
+      </w:pPr>
+      <w:r>
+        <w:rPr>
+          <w:rFonts w:ascii="Times New Roman" w:hAnsi="Times New Roman" w:eastAsia="宋体"/>
+          <w:b/>
+          <w:i w:val="0"/>
+          <w:sz w:val="21"/>
+        </w:rPr>
+        <w:t>Task (user mainline)</w:t>
+      </w:r>
+      <w:r>
+        <w:rPr>
+          <w:rFonts w:ascii="Times New Roman" w:hAnsi="Times New Roman" w:eastAsia="宋体"/>
+          <w:b w:val="0"/>
+          <w:i w:val="0"/>
+          <w:sz w:val="21"/>
+        </w:rPr>
+        <w:t>: add F1 (along-axis propulsion) / F3 (ratio_unit) to beam selection — small intervention comparison (beam5_f1f3 vs beam5 — 6 pairs — score = sent_proj + 0.3·(s_f1+s_f3)).</w:t>
+      </w:r>
+    </w:p>
+    <w:p>
+      <w:pPr>
+        <w:spacing w:after="120" w:line="300" w:lineRule="auto"/>
+        <w:ind w:firstLine="420"/>
+      </w:pPr>
+      <w:r>
+        <w:rPr>
+          <w:rFonts w:ascii="Times New Roman" w:hAnsi="Times New Roman" w:eastAsia="宋体"/>
+          <w:b/>
+          <w:i w:val="0"/>
+          <w:sz w:val="21"/>
+        </w:rPr>
+        <w:t>Result (honest)</w:t>
+      </w:r>
+      <w:r>
+        <w:rPr>
+          <w:rFonts w:ascii="Times New Roman" w:hAnsi="Times New Roman" w:eastAsia="宋体"/>
+          <w:b w:val="0"/>
+          <w:i w:val="0"/>
+          <w:sz w:val="21"/>
+        </w:rPr>
+        <w:t>:</w:t>
+      </w:r>
+    </w:p>
+    <w:p>
+      <w:pPr>
+        <w:spacing w:after="60" w:line="300" w:lineRule="auto"/>
+      </w:pPr>
+      <w:r>
+        <w:rPr>
+          <w:rFonts w:ascii="Times New Roman" w:hAnsi="Times New Roman" w:eastAsia="宋体"/>
+          <w:b/>
+          <w:i w:val="0"/>
+          <w:sz w:val="20"/>
+        </w:rPr>
+        <w:t>F1 direction effective</w:t>
+      </w:r>
+      <w:r>
+        <w:rPr>
+          <w:rFonts w:ascii="Times New Roman" w:hAnsi="Times New Roman" w:eastAsia="宋体"/>
+          <w:b w:val="0"/>
+          <w:i w:val="0"/>
+          <w:sz w:val="20"/>
+        </w:rPr>
+        <w:t xml:space="preserve">: along-axis propulsion 1.267 → </w:t>
+      </w:r>
+      <w:r>
+        <w:rPr>
+          <w:rFonts w:ascii="Times New Roman" w:hAnsi="Times New Roman" w:eastAsia="宋体"/>
+          <w:b/>
+          <w:i w:val="0"/>
+          <w:sz w:val="20"/>
+        </w:rPr>
+        <w:t>1.307 (+3.2% — generated text advances more along the axis)</w:t>
+      </w:r>
+    </w:p>
+    <w:p>
+      <w:pPr>
+        <w:spacing w:after="60" w:line="300" w:lineRule="auto"/>
+      </w:pPr>
+      <w:r>
+        <w:rPr>
+          <w:rFonts w:ascii="Times New Roman" w:hAnsi="Times New Roman" w:eastAsia="宋体"/>
+          <w:b/>
+          <w:i w:val="0"/>
+          <w:sz w:val="20"/>
+        </w:rPr>
+        <w:t>sent_proj not degraded</w:t>
+      </w:r>
+      <w:r>
+        <w:rPr>
+          <w:rFonts w:ascii="Times New Roman" w:hAnsi="Times New Roman" w:eastAsia="宋体"/>
+          <w:b w:val="0"/>
+          <w:i w:val="0"/>
+          <w:sz w:val="20"/>
+        </w:rPr>
+        <w:t xml:space="preserve"> (0.893 → 0.883 — within −0.01 line, marginally)</w:t>
+      </w:r>
+    </w:p>
+    <w:p>
+      <w:pPr>
+        <w:spacing w:after="60" w:line="300" w:lineRule="auto"/>
+      </w:pPr>
+      <w:r>
+        <w:rPr>
+          <w:rFonts w:ascii="Times New Roman" w:hAnsi="Times New Roman" w:eastAsia="宋体"/>
+          <w:b/>
+          <w:i w:val="0"/>
+          <w:sz w:val="20"/>
+        </w:rPr>
+        <w:t>F3 not effective</w:t>
+      </w:r>
+      <w:r>
+        <w:rPr>
+          <w:rFonts w:ascii="Times New Roman" w:hAnsi="Times New Roman" w:eastAsia="宋体"/>
+          <w:b w:val="0"/>
+          <w:i w:val="0"/>
+          <w:sz w:val="20"/>
+        </w:rPr>
+        <w:t xml:space="preserve"> (ratio_unit slightly up — candidates positively correlated with F1 or insufficient operating room — </w:t>
+      </w:r>
+      <w:r>
+        <w:rPr>
+          <w:rFonts w:ascii="Times New Roman" w:hAnsi="Times New Roman" w:eastAsia="宋体"/>
+          <w:b/>
+          <w:i w:val="0"/>
+          <w:sz w:val="20"/>
+        </w:rPr>
+        <w:t>F3 not a beam-scoring feature</w:t>
+      </w:r>
+      <w:r>
+        <w:rPr>
+          <w:rFonts w:ascii="Times New Roman" w:hAnsi="Times New Roman" w:eastAsia="宋体"/>
+          <w:b w:val="0"/>
+          <w:i w:val="0"/>
+          <w:sz w:val="20"/>
+        </w:rPr>
+        <w:t>)</w:t>
+      </w:r>
+    </w:p>
+    <w:p>
+      <w:pPr>
+        <w:spacing w:after="60" w:line="300" w:lineRule="auto"/>
+      </w:pPr>
+      <w:r>
+        <w:rPr>
+          <w:rFonts w:ascii="Times New Roman" w:hAnsi="Times New Roman" w:eastAsia="宋体"/>
+          <w:b w:val="0"/>
+          <w:i w:val="0"/>
+          <w:sz w:val="20"/>
+        </w:rPr>
+        <w:t>Implementation lessons: short-segment F1 scale shift (0.4–1.1 vs human 1.47 — normalization needs short-text reference); candidate clause-split exception (split_subclauses fix)</w:t>
+      </w:r>
+    </w:p>
+    <w:p>
+      <w:pPr>
+        <w:spacing w:after="120" w:line="300" w:lineRule="auto"/>
+        <w:ind w:firstLine="420"/>
+      </w:pPr>
+      <w:r>
+        <w:rPr>
+          <w:rFonts w:ascii="Times New Roman" w:hAnsi="Times New Roman" w:eastAsia="宋体"/>
+          <w:b/>
+          <w:i w:val="0"/>
+          <w:sz w:val="21"/>
+        </w:rPr>
+        <w:t>Conclusion</w:t>
+      </w:r>
+      <w:r>
+        <w:rPr>
+          <w:rFonts w:ascii="Times New Roman" w:hAnsi="Times New Roman" w:eastAsia="宋体"/>
+          <w:b w:val="0"/>
+          <w:i w:val="0"/>
+          <w:sz w:val="21"/>
+        </w:rPr>
+        <w:t xml:space="preserve">: </w:t>
+      </w:r>
+      <w:r>
+        <w:rPr>
+          <w:rFonts w:ascii="Times New Roman" w:hAnsi="Times New Roman" w:eastAsia="宋体"/>
+          <w:b/>
+          <w:i w:val="0"/>
+          <w:sz w:val="21"/>
+        </w:rPr>
+        <w:t>F1 usable as a beam-scoring feature (mild — inference-time layer) — F3 has no operating room</w:t>
+      </w:r>
+      <w:r>
+        <w:rPr>
+          <w:rFonts w:ascii="Times New Roman" w:hAnsi="Times New Roman" w:eastAsia="宋体"/>
+          <w:b w:val="0"/>
+          <w:i w:val="0"/>
+          <w:sz w:val="21"/>
+        </w:rPr>
+        <w:t xml:space="preserve"> — inference-time beam selection is partially saturated at the organizational layer (sent_proj captures most) — F1 fusion gives small increment — </w:t>
+      </w:r>
+      <w:r>
+        <w:rPr>
+          <w:rFonts w:ascii="Times New Roman" w:hAnsi="Times New Roman" w:eastAsia="宋体"/>
+          <w:b/>
+          <w:i w:val="0"/>
+          <w:sz w:val="21"/>
+        </w:rPr>
+        <w:t>training-time loss (F1 distribution matching) remains the main path for changing the organizational layer</w:t>
+      </w:r>
+      <w:r>
+        <w:rPr>
+          <w:rFonts w:ascii="Times New Roman" w:hAnsi="Times New Roman" w:eastAsia="宋体"/>
+          <w:b w:val="0"/>
+          <w:i w:val="0"/>
+          <w:sz w:val="21"/>
+        </w:rPr>
+        <w:t>.</w:t>
+      </w:r>
+    </w:p>
+    <w:p>
+      <w:pPr>
+        <w:keepNext/>
+        <w:spacing w:before="160" w:after="100"/>
+      </w:pPr>
+      <w:r>
+        <w:rPr>
+          <w:rFonts w:ascii="Times New Roman" w:hAnsi="Times New Roman" w:eastAsia="黑体"/>
+          <w:b/>
+          <w:i w:val="0"/>
+          <w:sz w:val="25"/>
+        </w:rPr>
+        <w:t>6.6.9 Math side-line consolidation (v0.85-7 — bin-mapping robust / real texts 1/3 / trajectory data gap)</w:t>
+      </w:r>
+    </w:p>
+    <w:p>
+      <w:pPr>
+        <w:spacing w:after="60" w:line="300" w:lineRule="auto"/>
+      </w:pPr>
+      <w:r>
+        <w:rPr>
+          <w:rFonts w:ascii="Times New Roman" w:hAnsi="Times New Roman" w:eastAsia="宋体"/>
+          <w:b/>
+          <w:i w:val="0"/>
+          <w:sz w:val="20"/>
+        </w:rPr>
+        <w:t>Bin-mapping robustness</w:t>
+      </w:r>
+      <w:r>
+        <w:rPr>
+          <w:rFonts w:ascii="Times New Roman" w:hAnsi="Times New Roman" w:eastAsia="宋体"/>
+          <w:b w:val="0"/>
+          <w:i w:val="0"/>
+          <w:sz w:val="20"/>
+        </w:rPr>
+        <w:t>: 4 cut/binning variants all PASS (Δsil +0.16~+0.29) — "operator-semantics independent structure" robust under discretization — normalized-decimal FAIL due to vmax under-coverage (multiplication C-range exceeds — design flaw, not counter-evidence)</w:t>
+      </w:r>
+    </w:p>
+    <w:p>
+      <w:pPr>
+        <w:spacing w:after="60" w:line="300" w:lineRule="auto"/>
+      </w:pPr>
+      <w:r>
+        <w:rPr>
+          <w:rFonts w:ascii="Times New Roman" w:hAnsi="Times New Roman" w:eastAsia="宋体"/>
+          <w:b/>
+          <w:i w:val="0"/>
+          <w:sz w:val="20"/>
+        </w:rPr>
+        <w:t>Real derivation texts</w:t>
+      </w:r>
+      <w:r>
+        <w:rPr>
+          <w:rFonts w:ascii="Times New Roman" w:hAnsi="Times New Roman" w:eastAsia="宋体"/>
+          <w:b w:val="0"/>
+          <w:i w:val="0"/>
+          <w:sz w:val="20"/>
+        </w:rPr>
+        <w:t xml:space="preserve">: 1/3 PASS — vertical arithmetic (verb-like operator semantics) has extra structure — application problems/equations differ by digit-combination patterns (placeholder replacement equally separable) — </w:t>
+      </w:r>
+      <w:r>
+        <w:rPr>
+          <w:rFonts w:ascii="Times New Roman" w:hAnsi="Times New Roman" w:eastAsia="宋体"/>
+          <w:b/>
+          <w:i w:val="0"/>
+          <w:sz w:val="20"/>
+        </w:rPr>
+        <w:t>template-arithmetic PASS does not generalize to real texts — formal math-intent analysis evidence limited</w:t>
+      </w:r>
+    </w:p>
+    <w:p>
+      <w:pPr>
+        <w:spacing w:after="60" w:line="300" w:lineRule="auto"/>
+      </w:pPr>
+      <w:r>
+        <w:rPr>
+          <w:rFonts w:ascii="Times New Roman" w:hAnsi="Times New Roman" w:eastAsia="宋体"/>
+          <w:b/>
+          <w:i w:val="0"/>
+          <w:sz w:val="20"/>
+        </w:rPr>
+        <w:t>Trajectory-feature data gap</w:t>
+      </w:r>
+      <w:r>
+        <w:rPr>
+          <w:rFonts w:ascii="Times New Roman" w:hAnsi="Times New Roman" w:eastAsia="宋体"/>
+          <w:b w:val="0"/>
+          <w:i w:val="0"/>
+          <w:sz w:val="20"/>
+        </w:rPr>
+        <w:t>: single math texts too short (&lt;15 diffs) — jump density/α/ratio_unit incalculable — needs long math-derivation corpus</w:t>
       </w:r>
     </w:p>
     <w:p>

</xml_diff>